<commit_message>
Added Set wise question addition for faculties
</commit_message>
<xml_diff>
--- a/backend/templates/template.docx
+++ b/backend/templates/template.docx
@@ -598,6 +598,15 @@
           <w:sz w:val="24"/>
           <w:szCs w:val="24"/>
         </w:rPr>
+        <w:t xml:space="preserve"> </w:t>
+      </w:r>
+      <w:r>
+        <w:rPr>
+          <w:rFonts w:ascii="Times New Roman" w:hAnsi="Times New Roman"/>
+          <w:b/>
+          <w:sz w:val="24"/>
+          <w:szCs w:val="24"/>
+        </w:rPr>
         <w:t xml:space="preserve">Academic Task Type: </w:t>
       </w:r>
       <w:r>
@@ -664,10 +673,10 @@
       </w:tblPr>
       <w:tblGrid>
         <w:gridCol w:w="1474"/>
-        <w:gridCol w:w="5632"/>
+        <w:gridCol w:w="5637"/>
         <w:gridCol w:w="2150"/>
-        <w:gridCol w:w="1784"/>
-        <w:gridCol w:w="2136"/>
+        <w:gridCol w:w="1783"/>
+        <w:gridCol w:w="2132"/>
       </w:tblGrid>
       <w:tr>
         <w:tc>
@@ -823,7 +832,7 @@
       </w:tr>
       <w:tr>
         <w:trPr>
-          <w:trHeight w:val="223"/>
+          <w:trHeight w:val="82"/>
         </w:trPr>
         <w:tc>
           <w:tcPr>
@@ -932,7 +941,7 @@
       </w:tr>
       <w:tr>
         <w:trPr>
-          <w:trHeight w:val="1088"/>
+          <w:trHeight w:val="74"/>
         </w:trPr>
         <w:tc>
           <w:tcPr>
@@ -943,16 +952,6 @@
             </w:tcBorders>
             <w:shd w:val="clear" w:color="auto" w:fill="auto"/>
           </w:tcPr>
-          <w:p>
-            <w:pPr>
-              <w:spacing w:after="0" w:line="240" w:lineRule="auto"/>
-              <w:rPr>
-                <w:rFonts w:ascii="Times New Roman" w:hAnsi="Times New Roman"/>
-                <w:sz w:val="24"/>
-                <w:szCs w:val="24"/>
-              </w:rPr>
-            </w:pPr>
-          </w:p>
           <w:p>
             <w:pPr>
               <w:spacing w:after="0" w:line="240" w:lineRule="auto"/>
@@ -988,13 +987,57 @@
           <w:p>
             <w:pPr>
               <w:spacing w:after="0" w:line="240" w:lineRule="auto"/>
-              <w:jc w:val="right"/>
-              <w:rPr>
-                <w:rFonts w:ascii="Times New Roman" w:hAnsi="Times New Roman"/>
+              <w:jc w:val="both"/>
+              <w:rPr>
+                <w:rFonts w:ascii="Times New Roman" w:hAnsi="Times New Roman"/>
+                <w:b/>
+                <w:bCs/>
                 <w:sz w:val="24"/>
                 <w:szCs w:val="24"/>
               </w:rPr>
             </w:pPr>
+            <w:r>
+              <w:rPr>
+                <w:rStyle w:val="markedcontent"/>
+                <w:rFonts w:ascii="Times New Roman" w:hAnsi="Times New Roman"/>
+                <w:b/>
+                <w:bCs/>
+                <w:sz w:val="24"/>
+                <w:szCs w:val="24"/>
+              </w:rPr>
+              <w:t>{text}</w:t>
+            </w:r>
+            <w:r>
+              <w:rPr>
+                <w:rFonts w:ascii="Times New Roman" w:hAnsi="Times New Roman"/>
+                <w:b/>
+                <w:bCs/>
+                <w:sz w:val="24"/>
+                <w:szCs w:val="24"/>
+              </w:rPr>
+              <w:t>{</w:t>
+            </w:r>
+            <w:r>
+              <w:rPr>
+                <w:rStyle w:val="hljs-selector-id"/>
+                <w:rFonts w:ascii="Times New Roman" w:hAnsi="Times New Roman"/>
+                <w:b/>
+                <w:bCs/>
+                <w:sz w:val="24"/>
+                <w:szCs w:val="24"/>
+              </w:rPr>
+              <w:t>#options</w:t>
+            </w:r>
+            <w:r>
+              <w:rPr>
+                <w:rFonts w:ascii="Times New Roman" w:hAnsi="Times New Roman"/>
+                <w:b/>
+                <w:bCs/>
+                <w:sz w:val="24"/>
+                <w:szCs w:val="24"/>
+              </w:rPr>
+              <w:t>}</w:t>
+            </w:r>
           </w:p>
           <w:p>
             <w:pPr>
@@ -1010,14 +1053,13 @@
             </w:pPr>
             <w:r>
               <w:rPr>
-                <w:rStyle w:val="markedcontent"/>
                 <w:rFonts w:ascii="Times New Roman" w:hAnsi="Times New Roman"/>
                 <w:b/>
                 <w:bCs/>
                 <w:sz w:val="24"/>
                 <w:szCs w:val="24"/>
               </w:rPr>
-              <w:t>{text}</w:t>
+              <w:t xml:space="preserve"> -{option}{/options}</w:t>
             </w:r>
           </w:p>
         </w:tc>
@@ -1035,26 +1077,6 @@
               <w:spacing w:after="0" w:line="240" w:lineRule="auto"/>
               <w:rPr>
                 <w:rFonts w:ascii="Times New Roman" w:hAnsi="Times New Roman"/>
-                <w:sz w:val="24"/>
-                <w:szCs w:val="24"/>
-              </w:rPr>
-            </w:pPr>
-            <w:r>
-              <w:rPr>
-                <w:rFonts w:ascii="Times New Roman" w:hAnsi="Times New Roman"/>
-                <w:sz w:val="24"/>
-                <w:szCs w:val="24"/>
-              </w:rPr>
-              <w:t xml:space="preserve">        </w:t>
-            </w:r>
-          </w:p>
-          <w:p>
-            <w:pPr>
-              <w:spacing w:after="0" w:line="240" w:lineRule="auto"/>
-              <w:rPr>
-                <w:rFonts w:ascii="Times New Roman" w:hAnsi="Times New Roman"/>
-                <w:b/>
-                <w:bCs/>
                 <w:sz w:val="24"/>
                 <w:szCs w:val="24"/>
               </w:rPr>
@@ -1085,16 +1107,6 @@
               <w:spacing w:after="0" w:line="240" w:lineRule="auto"/>
               <w:rPr>
                 <w:rFonts w:ascii="Times New Roman" w:hAnsi="Times New Roman"/>
-                <w:sz w:val="24"/>
-                <w:szCs w:val="24"/>
-              </w:rPr>
-            </w:pPr>
-          </w:p>
-          <w:p>
-            <w:pPr>
-              <w:spacing w:after="0" w:line="240" w:lineRule="auto"/>
-              <w:rPr>
-                <w:rFonts w:ascii="Times New Roman" w:hAnsi="Times New Roman"/>
                 <w:b/>
                 <w:bCs/>
                 <w:sz w:val="24"/>
@@ -1127,26 +1139,6 @@
               <w:spacing w:after="0" w:line="240" w:lineRule="auto"/>
               <w:rPr>
                 <w:rFonts w:ascii="Times New Roman" w:hAnsi="Times New Roman"/>
-                <w:sz w:val="24"/>
-                <w:szCs w:val="24"/>
-              </w:rPr>
-            </w:pPr>
-            <w:r>
-              <w:rPr>
-                <w:rFonts w:ascii="Times New Roman" w:hAnsi="Times New Roman"/>
-                <w:sz w:val="24"/>
-                <w:szCs w:val="24"/>
-              </w:rPr>
-              <w:t xml:space="preserve">             </w:t>
-            </w:r>
-          </w:p>
-          <w:p>
-            <w:pPr>
-              <w:spacing w:after="0" w:line="240" w:lineRule="auto"/>
-              <w:rPr>
-                <w:rFonts w:ascii="Times New Roman" w:hAnsi="Times New Roman"/>
-                <w:b/>
-                <w:bCs/>
                 <w:sz w:val="24"/>
                 <w:szCs w:val="24"/>
               </w:rPr>
@@ -3093,6 +3085,11 @@
     <w:basedOn w:val="DefaultParagraphFont"/>
     <w:rsid w:val="00781AE5"/>
   </w:style>
+  <w:style w:type="character" w:customStyle="1" w:styleId="hljs-selector-id">
+    <w:name w:val="hljs-selector-id"/>
+    <w:basedOn w:val="DefaultParagraphFont"/>
+    <w:rsid w:val="00950E2D"/>
+  </w:style>
 </w:styles>
 </file>
 

</xml_diff>